<commit_message>
new round of updates
</commit_message>
<xml_diff>
--- a/Supplementary_Table_S1.docx
+++ b/Supplementary_Table_S1.docx
@@ -49,7 +49,7 @@
           <w:sz w:val="24"/>
           <w:color w:val="333333"/>
         </w:rPr>
-        <w:t xml:space="default">Summary of centennial densities by site</w:t>
+        <w:t xml:space="default">Summary of fossil records by site (raw data)</w:t>
       </w:r>
     </w:p>
     <w:p>
@@ -65,7 +65,7 @@
           <w:sz w:val="20"/>
           <w:color w:val="333333"/>
         </w:rPr>
-        <w:t xml:space="default">average, dispersion, and extremes</w:t>
+        <w:t xml:space="default">Temporal distribution and dispersion per 0.1 ka bin</w:t>
       </w:r>
     </w:p>
     <w:tbl xmlns:w="http://schemas.openxmlformats.org/wordprocessingml/2006/main" xmlns:wp="http://schemas.openxmlformats.org/drawingml/2006/wordprocessingDrawing" xmlns:r="http://schemas.openxmlformats.org/officeDocument/2006/relationships" xmlns:w14="http://schemas.microsoft.com/office/word/2010/wordml">
@@ -97,14 +97,14 @@
             <w:pPr>
               <w:spacing w:before="0" w:after="60"/>
               <w:keepNext/>
-              <w:jc w:val="center"/>
-            </w:pPr>
-            <w:r>
-              <w:rPr>
-                <w:rFonts w:ascii="Calibri" w:hAnsi="Calibri"/>
-                <w:sz w:val="20"/>
-              </w:rPr>
-              <w:t xml:space="default">panel</w:t>
+              <w:jc w:val="start"/>
+            </w:pPr>
+            <w:r>
+              <w:rPr>
+                <w:rFonts w:ascii="Calibri" w:hAnsi="Calibri"/>
+                <w:sz w:val="20"/>
+              </w:rPr>
+              <w:t xml:space="default">spot</w:t>
             </w:r>
           </w:p>
         </w:tc>
@@ -126,7 +126,7 @@
                 <w:rFonts w:ascii="Calibri" w:hAnsi="Calibri"/>
                 <w:sz w:val="20"/>
               </w:rPr>
-              <w:t xml:space="default">mean_density</w:t>
+              <w:t xml:space="default">n_records</w:t>
             </w:r>
           </w:p>
         </w:tc>
@@ -148,7 +148,7 @@
                 <w:rFonts w:ascii="Calibri" w:hAnsi="Calibri"/>
                 <w:sz w:val="20"/>
               </w:rPr>
-              <w:t xml:space="default">sd_density</w:t>
+              <w:t xml:space="default">mean_t_ka</w:t>
             </w:r>
           </w:p>
         </w:tc>
@@ -170,7 +170,7 @@
                 <w:rFonts w:ascii="Calibri" w:hAnsi="Calibri"/>
                 <w:sz w:val="20"/>
               </w:rPr>
-              <w:t xml:space="default">se_density</w:t>
+              <w:t xml:space="default">sd_t_ka</w:t>
             </w:r>
           </w:p>
         </w:tc>
@@ -192,7 +192,7 @@
                 <w:rFonts w:ascii="Calibri" w:hAnsi="Calibri"/>
                 <w:sz w:val="20"/>
               </w:rPr>
-              <w:t xml:space="default">min_density</w:t>
+              <w:t xml:space="default">min_t_ka</w:t>
             </w:r>
           </w:p>
         </w:tc>
@@ -214,7 +214,7 @@
                 <w:rFonts w:ascii="Calibri" w:hAnsi="Calibri"/>
                 <w:sz w:val="20"/>
               </w:rPr>
-              <w:t xml:space="default">min_interval</w:t>
+              <w:t xml:space="default">max_t_ka</w:t>
             </w:r>
           </w:p>
         </w:tc>
@@ -236,7 +236,7 @@
                 <w:rFonts w:ascii="Calibri" w:hAnsi="Calibri"/>
                 <w:sz w:val="20"/>
               </w:rPr>
-              <w:t xml:space="default">max_density</w:t>
+              <w:t xml:space="default">min_interval</w:t>
             </w:r>
           </w:p>
         </w:tc>
@@ -245,6 +245,7 @@
             <w:tcBorders>
               <w:top w:val="single" w:sz="16" w:space="0" w:color="D3D3D3"/>
               <w:bottom w:val="single" w:sz="16" w:space="0" w:color="D3D3D3"/>
+              <w:end w:val="single" w:space="0" w:color="D3D3D3"/>
             </w:tcBorders>
           </w:tcPr>
           <w:p>
@@ -259,29 +260,6 @@
                 <w:sz w:val="20"/>
               </w:rPr>
               <w:t xml:space="default">max_interval</w:t>
-            </w:r>
-          </w:p>
-        </w:tc>
-        <w:tc>
-          <w:tcPr>
-            <w:tcBorders>
-              <w:top w:val="single" w:sz="16" w:space="0" w:color="D3D3D3"/>
-              <w:bottom w:val="single" w:sz="16" w:space="0" w:color="D3D3D3"/>
-              <w:end w:val="single" w:space="0" w:color="D3D3D3"/>
-            </w:tcBorders>
-          </w:tcPr>
-          <w:p>
-            <w:pPr>
-              <w:spacing w:before="0" w:after="60"/>
-              <w:keepNext/>
-              <w:jc w:val="end"/>
-            </w:pPr>
-            <w:r>
-              <w:rPr>
-                <w:rFonts w:ascii="Calibri" w:hAnsi="Calibri"/>
-                <w:sz w:val="20"/>
-              </w:rPr>
-              <w:t xml:space="default">n_intervals</w:t>
             </w:r>
           </w:p>
         </w:tc>
@@ -303,7 +281,7 @@
             <w:pPr>
               <w:spacing w:before="0" w:after="60"/>
               <w:keepNext/>
-              <w:jc w:val="center"/>
+              <w:jc w:val="start"/>
             </w:pPr>
             <w:r>
               <w:rPr>
@@ -334,55 +312,55 @@
                 <w:rFonts w:ascii="Calibri" w:hAnsi="Calibri"/>
                 <w:sz w:val="20"/>
               </w:rPr>
-              <w:t xml:space="default">0.163</w:t>
-            </w:r>
-          </w:p>
-        </w:tc>
-        <w:tc>
-          <w:tcPr>
-            <w:tcBorders>
-              <w:top w:val="single" w:space="0" w:color="D3D3D3"/>
-              <w:bottom w:val="single" w:space="0" w:color="D3D3D3"/>
-              <w:start w:val="single" w:space="0" w:color="D3D3D3"/>
-              <w:end w:val="single" w:space="0" w:color="D3D3D3"/>
-            </w:tcBorders>
-          </w:tcPr>
-          <w:p>
-            <w:pPr>
-              <w:spacing w:before="0" w:after="60"/>
-              <w:keepNext/>
-              <w:jc w:val="end"/>
-            </w:pPr>
-            <w:r>
-              <w:rPr>
-                <w:rFonts w:ascii="Calibri" w:hAnsi="Calibri"/>
-                <w:sz w:val="20"/>
-              </w:rPr>
-              <w:t xml:space="default">0.023</w:t>
-            </w:r>
-          </w:p>
-        </w:tc>
-        <w:tc>
-          <w:tcPr>
-            <w:tcBorders>
-              <w:top w:val="single" w:space="0" w:color="D3D3D3"/>
-              <w:bottom w:val="single" w:space="0" w:color="D3D3D3"/>
-              <w:start w:val="single" w:space="0" w:color="D3D3D3"/>
-              <w:end w:val="single" w:space="0" w:color="D3D3D3"/>
-            </w:tcBorders>
-          </w:tcPr>
-          <w:p>
-            <w:pPr>
-              <w:spacing w:before="0" w:after="60"/>
-              <w:keepNext/>
-              <w:jc w:val="end"/>
-            </w:pPr>
-            <w:r>
-              <w:rPr>
-                <w:rFonts w:ascii="Calibri" w:hAnsi="Calibri"/>
-                <w:sz w:val="20"/>
-              </w:rPr>
-              <w:t xml:space="default">0.008</w:t>
+              <w:t xml:space="default">41</w:t>
+            </w:r>
+          </w:p>
+        </w:tc>
+        <w:tc>
+          <w:tcPr>
+            <w:tcBorders>
+              <w:top w:val="single" w:space="0" w:color="D3D3D3"/>
+              <w:bottom w:val="single" w:space="0" w:color="D3D3D3"/>
+              <w:start w:val="single" w:space="0" w:color="D3D3D3"/>
+              <w:end w:val="single" w:space="0" w:color="D3D3D3"/>
+            </w:tcBorders>
+          </w:tcPr>
+          <w:p>
+            <w:pPr>
+              <w:spacing w:before="0" w:after="60"/>
+              <w:keepNext/>
+              <w:jc w:val="end"/>
+            </w:pPr>
+            <w:r>
+              <w:rPr>
+                <w:rFonts w:ascii="Calibri" w:hAnsi="Calibri"/>
+                <w:sz w:val="20"/>
+              </w:rPr>
+              <w:t xml:space="default">2.921</w:t>
+            </w:r>
+          </w:p>
+        </w:tc>
+        <w:tc>
+          <w:tcPr>
+            <w:tcBorders>
+              <w:top w:val="single" w:space="0" w:color="D3D3D3"/>
+              <w:bottom w:val="single" w:space="0" w:color="D3D3D3"/>
+              <w:start w:val="single" w:space="0" w:color="D3D3D3"/>
+              <w:end w:val="single" w:space="0" w:color="D3D3D3"/>
+            </w:tcBorders>
+          </w:tcPr>
+          <w:p>
+            <w:pPr>
+              <w:spacing w:before="0" w:after="60"/>
+              <w:keepNext/>
+              <w:jc w:val="end"/>
+            </w:pPr>
+            <w:r>
+              <w:rPr>
+                <w:rFonts w:ascii="Calibri" w:hAnsi="Calibri"/>
+                <w:sz w:val="20"/>
+              </w:rPr>
+              <w:t xml:space="default">2.034</w:t>
             </w:r>
           </w:p>
         </w:tc>
@@ -430,79 +408,55 @@
                 <w:rFonts w:ascii="Calibri" w:hAnsi="Calibri"/>
                 <w:sz w:val="20"/>
               </w:rPr>
-              <w:t xml:space="default">2.350</w:t>
-            </w:r>
-          </w:p>
-        </w:tc>
-        <w:tc>
-          <w:tcPr>
-            <w:tcBorders>
-              <w:top w:val="single" w:space="0" w:color="D3D3D3"/>
-              <w:bottom w:val="single" w:space="0" w:color="D3D3D3"/>
-              <w:start w:val="single" w:space="0" w:color="D3D3D3"/>
-              <w:end w:val="single" w:space="0" w:color="D3D3D3"/>
-            </w:tcBorders>
-          </w:tcPr>
-          <w:p>
-            <w:pPr>
-              <w:spacing w:before="0" w:after="60"/>
-              <w:keepNext/>
-              <w:jc w:val="end"/>
-            </w:pPr>
-            <w:r>
-              <w:rPr>
-                <w:rFonts w:ascii="Calibri" w:hAnsi="Calibri"/>
-                <w:sz w:val="20"/>
-              </w:rPr>
-              <w:t xml:space="default">0.617</w:t>
-            </w:r>
-          </w:p>
-        </w:tc>
-        <w:tc>
-          <w:tcPr>
-            <w:tcBorders>
-              <w:top w:val="single" w:space="0" w:color="D3D3D3"/>
-              <w:bottom w:val="single" w:space="0" w:color="D3D3D3"/>
-              <w:start w:val="single" w:space="0" w:color="D3D3D3"/>
-              <w:end w:val="single" w:space="0" w:color="D3D3D3"/>
-            </w:tcBorders>
-          </w:tcPr>
-          <w:p>
-            <w:pPr>
-              <w:spacing w:before="0" w:after="60"/>
-              <w:keepNext/>
-              <w:jc w:val="end"/>
-            </w:pPr>
-            <w:r>
-              <w:rPr>
-                <w:rFonts w:ascii="Calibri" w:hAnsi="Calibri"/>
-                <w:sz w:val="20"/>
-              </w:rPr>
-              <w:t xml:space="default">0.150</w:t>
-            </w:r>
-          </w:p>
-        </w:tc>
-        <w:tc>
-          <w:tcPr>
-            <w:tcBorders>
-              <w:top w:val="single" w:space="0" w:color="D3D3D3"/>
-              <w:bottom w:val="single" w:space="0" w:color="D3D3D3"/>
-              <w:start w:val="single" w:space="0" w:color="D3D3D3"/>
-              <w:end w:val="single" w:space="0" w:color="D3D3D3"/>
-            </w:tcBorders>
-          </w:tcPr>
-          <w:p>
-            <w:pPr>
-              <w:spacing w:before="0" w:after="60"/>
-              <w:keepNext/>
-              <w:jc w:val="end"/>
-            </w:pPr>
-            <w:r>
-              <w:rPr>
-                <w:rFonts w:ascii="Calibri" w:hAnsi="Calibri"/>
-                <w:sz w:val="20"/>
-              </w:rPr>
-              <w:t xml:space="default">60</w:t>
+              <w:t xml:space="default">6.000</w:t>
+            </w:r>
+          </w:p>
+        </w:tc>
+        <w:tc>
+          <w:tcPr>
+            <w:tcBorders>
+              <w:top w:val="single" w:space="0" w:color="D3D3D3"/>
+              <w:bottom w:val="single" w:space="0" w:color="D3D3D3"/>
+              <w:start w:val="single" w:space="0" w:color="D3D3D3"/>
+              <w:end w:val="single" w:space="0" w:color="D3D3D3"/>
+            </w:tcBorders>
+          </w:tcPr>
+          <w:p>
+            <w:pPr>
+              <w:spacing w:before="0" w:after="60"/>
+              <w:keepNext/>
+              <w:jc w:val="end"/>
+            </w:pPr>
+            <w:r>
+              <w:rPr>
+                <w:rFonts w:ascii="Calibri" w:hAnsi="Calibri"/>
+                <w:sz w:val="20"/>
+              </w:rPr>
+              <w:t xml:space="default">0.100</w:t>
+            </w:r>
+          </w:p>
+        </w:tc>
+        <w:tc>
+          <w:tcPr>
+            <w:tcBorders>
+              <w:top w:val="single" w:space="0" w:color="D3D3D3"/>
+              <w:bottom w:val="single" w:space="0" w:color="D3D3D3"/>
+              <w:start w:val="single" w:space="0" w:color="D3D3D3"/>
+              <w:end w:val="single" w:space="0" w:color="D3D3D3"/>
+            </w:tcBorders>
+          </w:tcPr>
+          <w:p>
+            <w:pPr>
+              <w:spacing w:before="0" w:after="60"/>
+              <w:keepNext/>
+              <w:jc w:val="end"/>
+            </w:pPr>
+            <w:r>
+              <w:rPr>
+                <w:rFonts w:ascii="Calibri" w:hAnsi="Calibri"/>
+                <w:sz w:val="20"/>
+              </w:rPr>
+              <w:t xml:space="default">6.000</w:t>
             </w:r>
           </w:p>
         </w:tc>
@@ -524,7 +478,7 @@
             <w:pPr>
               <w:spacing w:before="0" w:after="60"/>
               <w:keepNext/>
-              <w:jc w:val="center"/>
+              <w:jc w:val="start"/>
             </w:pPr>
             <w:r>
               <w:rPr>
@@ -555,175 +509,151 @@
                 <w:rFonts w:ascii="Calibri" w:hAnsi="Calibri"/>
                 <w:sz w:val="20"/>
               </w:rPr>
-              <w:t xml:space="default">0.156</w:t>
-            </w:r>
-          </w:p>
-        </w:tc>
-        <w:tc>
-          <w:tcPr>
-            <w:tcBorders>
-              <w:top w:val="single" w:space="0" w:color="D3D3D3"/>
-              <w:bottom w:val="single" w:space="0" w:color="D3D3D3"/>
-              <w:start w:val="single" w:space="0" w:color="D3D3D3"/>
-              <w:end w:val="single" w:space="0" w:color="D3D3D3"/>
-            </w:tcBorders>
-          </w:tcPr>
-          <w:p>
-            <w:pPr>
-              <w:spacing w:before="0" w:after="60"/>
-              <w:keepNext/>
-              <w:jc w:val="end"/>
-            </w:pPr>
-            <w:r>
-              <w:rPr>
-                <w:rFonts w:ascii="Calibri" w:hAnsi="Calibri"/>
-                <w:sz w:val="20"/>
-              </w:rPr>
-              <w:t xml:space="default">0.018</w:t>
-            </w:r>
-          </w:p>
-        </w:tc>
-        <w:tc>
-          <w:tcPr>
-            <w:tcBorders>
-              <w:top w:val="single" w:space="0" w:color="D3D3D3"/>
-              <w:bottom w:val="single" w:space="0" w:color="D3D3D3"/>
-              <w:start w:val="single" w:space="0" w:color="D3D3D3"/>
-              <w:end w:val="single" w:space="0" w:color="D3D3D3"/>
-            </w:tcBorders>
-          </w:tcPr>
-          <w:p>
-            <w:pPr>
-              <w:spacing w:before="0" w:after="60"/>
-              <w:keepNext/>
-              <w:jc w:val="end"/>
-            </w:pPr>
-            <w:r>
-              <w:rPr>
-                <w:rFonts w:ascii="Calibri" w:hAnsi="Calibri"/>
-                <w:sz w:val="20"/>
-              </w:rPr>
-              <w:t xml:space="default">0.006</w:t>
-            </w:r>
-          </w:p>
-        </w:tc>
-        <w:tc>
-          <w:tcPr>
-            <w:tcBorders>
-              <w:top w:val="single" w:space="0" w:color="D3D3D3"/>
-              <w:bottom w:val="single" w:space="0" w:color="D3D3D3"/>
-              <w:start w:val="single" w:space="0" w:color="D3D3D3"/>
-              <w:end w:val="single" w:space="0" w:color="D3D3D3"/>
-            </w:tcBorders>
-          </w:tcPr>
-          <w:p>
-            <w:pPr>
-              <w:spacing w:before="0" w:after="60"/>
-              <w:keepNext/>
-              <w:jc w:val="end"/>
-            </w:pPr>
-            <w:r>
-              <w:rPr>
-                <w:rFonts w:ascii="Calibri" w:hAnsi="Calibri"/>
-                <w:sz w:val="20"/>
-              </w:rPr>
-              <w:t xml:space="default">0.001</w:t>
-            </w:r>
-          </w:p>
-        </w:tc>
-        <w:tc>
-          <w:tcPr>
-            <w:tcBorders>
-              <w:top w:val="single" w:space="0" w:color="D3D3D3"/>
-              <w:bottom w:val="single" w:space="0" w:color="D3D3D3"/>
-              <w:start w:val="single" w:space="0" w:color="D3D3D3"/>
-              <w:end w:val="single" w:space="0" w:color="D3D3D3"/>
-            </w:tcBorders>
-          </w:tcPr>
-          <w:p>
-            <w:pPr>
-              <w:spacing w:before="0" w:after="60"/>
-              <w:keepNext/>
-              <w:jc w:val="end"/>
-            </w:pPr>
-            <w:r>
-              <w:rPr>
-                <w:rFonts w:ascii="Calibri" w:hAnsi="Calibri"/>
-                <w:sz w:val="20"/>
-              </w:rPr>
-              <w:t xml:space="default">1.550</w:t>
-            </w:r>
-          </w:p>
-        </w:tc>
-        <w:tc>
-          <w:tcPr>
-            <w:tcBorders>
-              <w:top w:val="single" w:space="0" w:color="D3D3D3"/>
-              <w:bottom w:val="single" w:space="0" w:color="D3D3D3"/>
-              <w:start w:val="single" w:space="0" w:color="D3D3D3"/>
-              <w:end w:val="single" w:space="0" w:color="D3D3D3"/>
-            </w:tcBorders>
-          </w:tcPr>
-          <w:p>
-            <w:pPr>
-              <w:spacing w:before="0" w:after="60"/>
-              <w:keepNext/>
-              <w:jc w:val="end"/>
-            </w:pPr>
-            <w:r>
-              <w:rPr>
-                <w:rFonts w:ascii="Calibri" w:hAnsi="Calibri"/>
-                <w:sz w:val="20"/>
-              </w:rPr>
-              <w:t xml:space="default">0.669</w:t>
-            </w:r>
-          </w:p>
-        </w:tc>
-        <w:tc>
-          <w:tcPr>
-            <w:tcBorders>
-              <w:top w:val="single" w:space="0" w:color="D3D3D3"/>
-              <w:bottom w:val="single" w:space="0" w:color="D3D3D3"/>
-              <w:start w:val="single" w:space="0" w:color="D3D3D3"/>
-              <w:end w:val="single" w:space="0" w:color="D3D3D3"/>
-            </w:tcBorders>
-          </w:tcPr>
-          <w:p>
-            <w:pPr>
-              <w:spacing w:before="0" w:after="60"/>
-              <w:keepNext/>
-              <w:jc w:val="end"/>
-            </w:pPr>
-            <w:r>
-              <w:rPr>
-                <w:rFonts w:ascii="Calibri" w:hAnsi="Calibri"/>
-                <w:sz w:val="20"/>
-              </w:rPr>
-              <w:t xml:space="default">4.250</w:t>
-            </w:r>
-          </w:p>
-        </w:tc>
-        <w:tc>
-          <w:tcPr>
-            <w:tcBorders>
-              <w:top w:val="single" w:space="0" w:color="D3D3D3"/>
-              <w:bottom w:val="single" w:space="0" w:color="D3D3D3"/>
-              <w:start w:val="single" w:space="0" w:color="D3D3D3"/>
-              <w:end w:val="single" w:space="0" w:color="D3D3D3"/>
-            </w:tcBorders>
-          </w:tcPr>
-          <w:p>
-            <w:pPr>
-              <w:spacing w:before="0" w:after="60"/>
-              <w:keepNext/>
-              <w:jc w:val="end"/>
-            </w:pPr>
-            <w:r>
-              <w:rPr>
-                <w:rFonts w:ascii="Calibri" w:hAnsi="Calibri"/>
-                <w:sz w:val="20"/>
-              </w:rPr>
-              <w:t xml:space="default">60</w:t>
+              <w:t xml:space="default">128</w:t>
+            </w:r>
+          </w:p>
+        </w:tc>
+        <w:tc>
+          <w:tcPr>
+            <w:tcBorders>
+              <w:top w:val="single" w:space="0" w:color="D3D3D3"/>
+              <w:bottom w:val="single" w:space="0" w:color="D3D3D3"/>
+              <w:start w:val="single" w:space="0" w:color="D3D3D3"/>
+              <w:end w:val="single" w:space="0" w:color="D3D3D3"/>
+            </w:tcBorders>
+          </w:tcPr>
+          <w:p>
+            <w:pPr>
+              <w:spacing w:before="0" w:after="60"/>
+              <w:keepNext/>
+              <w:jc w:val="end"/>
+            </w:pPr>
+            <w:r>
+              <w:rPr>
+                <w:rFonts w:ascii="Calibri" w:hAnsi="Calibri"/>
+                <w:sz w:val="20"/>
+              </w:rPr>
+              <w:t xml:space="default">3.637</w:t>
+            </w:r>
+          </w:p>
+        </w:tc>
+        <w:tc>
+          <w:tcPr>
+            <w:tcBorders>
+              <w:top w:val="single" w:space="0" w:color="D3D3D3"/>
+              <w:bottom w:val="single" w:space="0" w:color="D3D3D3"/>
+              <w:start w:val="single" w:space="0" w:color="D3D3D3"/>
+              <w:end w:val="single" w:space="0" w:color="D3D3D3"/>
+            </w:tcBorders>
+          </w:tcPr>
+          <w:p>
+            <w:pPr>
+              <w:spacing w:before="0" w:after="60"/>
+              <w:keepNext/>
+              <w:jc w:val="end"/>
+            </w:pPr>
+            <w:r>
+              <w:rPr>
+                <w:rFonts w:ascii="Calibri" w:hAnsi="Calibri"/>
+                <w:sz w:val="20"/>
+              </w:rPr>
+              <w:t xml:space="default">1.482</w:t>
+            </w:r>
+          </w:p>
+        </w:tc>
+        <w:tc>
+          <w:tcPr>
+            <w:tcBorders>
+              <w:top w:val="single" w:space="0" w:color="D3D3D3"/>
+              <w:bottom w:val="single" w:space="0" w:color="D3D3D3"/>
+              <w:start w:val="single" w:space="0" w:color="D3D3D3"/>
+              <w:end w:val="single" w:space="0" w:color="D3D3D3"/>
+            </w:tcBorders>
+          </w:tcPr>
+          <w:p>
+            <w:pPr>
+              <w:spacing w:before="0" w:after="60"/>
+              <w:keepNext/>
+              <w:jc w:val="end"/>
+            </w:pPr>
+            <w:r>
+              <w:rPr>
+                <w:rFonts w:ascii="Calibri" w:hAnsi="Calibri"/>
+                <w:sz w:val="20"/>
+              </w:rPr>
+              <w:t xml:space="default">0.000</w:t>
+            </w:r>
+          </w:p>
+        </w:tc>
+        <w:tc>
+          <w:tcPr>
+            <w:tcBorders>
+              <w:top w:val="single" w:space="0" w:color="D3D3D3"/>
+              <w:bottom w:val="single" w:space="0" w:color="D3D3D3"/>
+              <w:start w:val="single" w:space="0" w:color="D3D3D3"/>
+              <w:end w:val="single" w:space="0" w:color="D3D3D3"/>
+            </w:tcBorders>
+          </w:tcPr>
+          <w:p>
+            <w:pPr>
+              <w:spacing w:before="0" w:after="60"/>
+              <w:keepNext/>
+              <w:jc w:val="end"/>
+            </w:pPr>
+            <w:r>
+              <w:rPr>
+                <w:rFonts w:ascii="Calibri" w:hAnsi="Calibri"/>
+                <w:sz w:val="20"/>
+              </w:rPr>
+              <w:t xml:space="default">5.998</w:t>
+            </w:r>
+          </w:p>
+        </w:tc>
+        <w:tc>
+          <w:tcPr>
+            <w:tcBorders>
+              <w:top w:val="single" w:space="0" w:color="D3D3D3"/>
+              <w:bottom w:val="single" w:space="0" w:color="D3D3D3"/>
+              <w:start w:val="single" w:space="0" w:color="D3D3D3"/>
+              <w:end w:val="single" w:space="0" w:color="D3D3D3"/>
+            </w:tcBorders>
+          </w:tcPr>
+          <w:p>
+            <w:pPr>
+              <w:spacing w:before="0" w:after="60"/>
+              <w:keepNext/>
+              <w:jc w:val="end"/>
+            </w:pPr>
+            <w:r>
+              <w:rPr>
+                <w:rFonts w:ascii="Calibri" w:hAnsi="Calibri"/>
+                <w:sz w:val="20"/>
+              </w:rPr>
+              <w:t xml:space="default">0.100</w:t>
+            </w:r>
+          </w:p>
+        </w:tc>
+        <w:tc>
+          <w:tcPr>
+            <w:tcBorders>
+              <w:top w:val="single" w:space="0" w:color="D3D3D3"/>
+              <w:bottom w:val="single" w:space="0" w:color="D3D3D3"/>
+              <w:start w:val="single" w:space="0" w:color="D3D3D3"/>
+              <w:end w:val="single" w:space="0" w:color="D3D3D3"/>
+            </w:tcBorders>
+          </w:tcPr>
+          <w:p>
+            <w:pPr>
+              <w:spacing w:before="0" w:after="60"/>
+              <w:keepNext/>
+              <w:jc w:val="end"/>
+            </w:pPr>
+            <w:r>
+              <w:rPr>
+                <w:rFonts w:ascii="Calibri" w:hAnsi="Calibri"/>
+                <w:sz w:val="20"/>
+              </w:rPr>
+              <w:t xml:space="default">6.000</w:t>
             </w:r>
           </w:p>
         </w:tc>
@@ -745,7 +675,7 @@
             <w:pPr>
               <w:spacing w:before="0" w:after="60"/>
               <w:keepNext/>
-              <w:jc w:val="center"/>
+              <w:jc w:val="start"/>
             </w:pPr>
             <w:r>
               <w:rPr>
@@ -776,175 +706,151 @@
                 <w:rFonts w:ascii="Calibri" w:hAnsi="Calibri"/>
                 <w:sz w:val="20"/>
               </w:rPr>
-              <w:t xml:space="default">0.169</w:t>
-            </w:r>
-          </w:p>
-        </w:tc>
-        <w:tc>
-          <w:tcPr>
-            <w:tcBorders>
-              <w:top w:val="single" w:space="0" w:color="D3D3D3"/>
-              <w:bottom w:val="single" w:space="0" w:color="D3D3D3"/>
-              <w:start w:val="single" w:space="0" w:color="D3D3D3"/>
-              <w:end w:val="single" w:space="0" w:color="D3D3D3"/>
-            </w:tcBorders>
-          </w:tcPr>
-          <w:p>
-            <w:pPr>
-              <w:spacing w:before="0" w:after="60"/>
-              <w:keepNext/>
-              <w:jc w:val="end"/>
-            </w:pPr>
-            <w:r>
-              <w:rPr>
-                <w:rFonts w:ascii="Calibri" w:hAnsi="Calibri"/>
-                <w:sz w:val="20"/>
-              </w:rPr>
-              <w:t xml:space="default">0.022</w:t>
-            </w:r>
-          </w:p>
-        </w:tc>
-        <w:tc>
-          <w:tcPr>
-            <w:tcBorders>
-              <w:top w:val="single" w:space="0" w:color="D3D3D3"/>
-              <w:bottom w:val="single" w:space="0" w:color="D3D3D3"/>
-              <w:start w:val="single" w:space="0" w:color="D3D3D3"/>
-              <w:end w:val="single" w:space="0" w:color="D3D3D3"/>
-            </w:tcBorders>
-          </w:tcPr>
-          <w:p>
-            <w:pPr>
-              <w:spacing w:before="0" w:after="60"/>
-              <w:keepNext/>
-              <w:jc w:val="end"/>
-            </w:pPr>
-            <w:r>
-              <w:rPr>
-                <w:rFonts w:ascii="Calibri" w:hAnsi="Calibri"/>
-                <w:sz w:val="20"/>
-              </w:rPr>
-              <w:t xml:space="default">0.007</w:t>
-            </w:r>
-          </w:p>
-        </w:tc>
-        <w:tc>
-          <w:tcPr>
-            <w:tcBorders>
-              <w:top w:val="single" w:space="0" w:color="D3D3D3"/>
-              <w:bottom w:val="single" w:space="0" w:color="D3D3D3"/>
-              <w:start w:val="single" w:space="0" w:color="D3D3D3"/>
-              <w:end w:val="single" w:space="0" w:color="D3D3D3"/>
-            </w:tcBorders>
-          </w:tcPr>
-          <w:p>
-            <w:pPr>
-              <w:spacing w:before="0" w:after="60"/>
-              <w:keepNext/>
-              <w:jc w:val="end"/>
-            </w:pPr>
-            <w:r>
-              <w:rPr>
-                <w:rFonts w:ascii="Calibri" w:hAnsi="Calibri"/>
-                <w:sz w:val="20"/>
-              </w:rPr>
-              <w:t xml:space="default">0.000</w:t>
-            </w:r>
-          </w:p>
-        </w:tc>
-        <w:tc>
-          <w:tcPr>
-            <w:tcBorders>
-              <w:top w:val="single" w:space="0" w:color="D3D3D3"/>
-              <w:bottom w:val="single" w:space="0" w:color="D3D3D3"/>
-              <w:start w:val="single" w:space="0" w:color="D3D3D3"/>
-              <w:end w:val="single" w:space="0" w:color="D3D3D3"/>
-            </w:tcBorders>
-          </w:tcPr>
-          <w:p>
-            <w:pPr>
-              <w:spacing w:before="0" w:after="60"/>
-              <w:keepNext/>
-              <w:jc w:val="end"/>
-            </w:pPr>
-            <w:r>
-              <w:rPr>
-                <w:rFonts w:ascii="Calibri" w:hAnsi="Calibri"/>
-                <w:sz w:val="20"/>
-              </w:rPr>
-              <w:t xml:space="default">5.950</w:t>
-            </w:r>
-          </w:p>
-        </w:tc>
-        <w:tc>
-          <w:tcPr>
-            <w:tcBorders>
-              <w:top w:val="single" w:space="0" w:color="D3D3D3"/>
-              <w:bottom w:val="single" w:space="0" w:color="D3D3D3"/>
-              <w:start w:val="single" w:space="0" w:color="D3D3D3"/>
-              <w:end w:val="single" w:space="0" w:color="D3D3D3"/>
-            </w:tcBorders>
-          </w:tcPr>
-          <w:p>
-            <w:pPr>
-              <w:spacing w:before="0" w:after="60"/>
-              <w:keepNext/>
-              <w:jc w:val="end"/>
-            </w:pPr>
-            <w:r>
-              <w:rPr>
-                <w:rFonts w:ascii="Calibri" w:hAnsi="Calibri"/>
-                <w:sz w:val="20"/>
-              </w:rPr>
-              <w:t xml:space="default">1.011</w:t>
-            </w:r>
-          </w:p>
-        </w:tc>
-        <w:tc>
-          <w:tcPr>
-            <w:tcBorders>
-              <w:top w:val="single" w:space="0" w:color="D3D3D3"/>
-              <w:bottom w:val="single" w:space="0" w:color="D3D3D3"/>
-              <w:start w:val="single" w:space="0" w:color="D3D3D3"/>
-              <w:end w:val="single" w:space="0" w:color="D3D3D3"/>
-            </w:tcBorders>
-          </w:tcPr>
-          <w:p>
-            <w:pPr>
-              <w:spacing w:before="0" w:after="60"/>
-              <w:keepNext/>
-              <w:jc w:val="end"/>
-            </w:pPr>
-            <w:r>
-              <w:rPr>
-                <w:rFonts w:ascii="Calibri" w:hAnsi="Calibri"/>
-                <w:sz w:val="20"/>
-              </w:rPr>
-              <w:t xml:space="default">0.150</w:t>
-            </w:r>
-          </w:p>
-        </w:tc>
-        <w:tc>
-          <w:tcPr>
-            <w:tcBorders>
-              <w:top w:val="single" w:space="0" w:color="D3D3D3"/>
-              <w:bottom w:val="single" w:space="0" w:color="D3D3D3"/>
-              <w:start w:val="single" w:space="0" w:color="D3D3D3"/>
-              <w:end w:val="single" w:space="0" w:color="D3D3D3"/>
-            </w:tcBorders>
-          </w:tcPr>
-          <w:p>
-            <w:pPr>
-              <w:spacing w:before="0" w:after="60"/>
-              <w:keepNext/>
-              <w:jc w:val="end"/>
-            </w:pPr>
-            <w:r>
-              <w:rPr>
-                <w:rFonts w:ascii="Calibri" w:hAnsi="Calibri"/>
-                <w:sz w:val="20"/>
-              </w:rPr>
-              <w:t xml:space="default">60</w:t>
+              <w:t xml:space="default">64</w:t>
+            </w:r>
+          </w:p>
+        </w:tc>
+        <w:tc>
+          <w:tcPr>
+            <w:tcBorders>
+              <w:top w:val="single" w:space="0" w:color="D3D3D3"/>
+              <w:bottom w:val="single" w:space="0" w:color="D3D3D3"/>
+              <w:start w:val="single" w:space="0" w:color="D3D3D3"/>
+              <w:end w:val="single" w:space="0" w:color="D3D3D3"/>
+            </w:tcBorders>
+          </w:tcPr>
+          <w:p>
+            <w:pPr>
+              <w:spacing w:before="0" w:after="60"/>
+              <w:keepNext/>
+              <w:jc w:val="end"/>
+            </w:pPr>
+            <w:r>
+              <w:rPr>
+                <w:rFonts w:ascii="Calibri" w:hAnsi="Calibri"/>
+                <w:sz w:val="20"/>
+              </w:rPr>
+              <w:t xml:space="default">2.259</w:t>
+            </w:r>
+          </w:p>
+        </w:tc>
+        <w:tc>
+          <w:tcPr>
+            <w:tcBorders>
+              <w:top w:val="single" w:space="0" w:color="D3D3D3"/>
+              <w:bottom w:val="single" w:space="0" w:color="D3D3D3"/>
+              <w:start w:val="single" w:space="0" w:color="D3D3D3"/>
+              <w:end w:val="single" w:space="0" w:color="D3D3D3"/>
+            </w:tcBorders>
+          </w:tcPr>
+          <w:p>
+            <w:pPr>
+              <w:spacing w:before="0" w:after="60"/>
+              <w:keepNext/>
+              <w:jc w:val="end"/>
+            </w:pPr>
+            <w:r>
+              <w:rPr>
+                <w:rFonts w:ascii="Calibri" w:hAnsi="Calibri"/>
+                <w:sz w:val="20"/>
+              </w:rPr>
+              <w:t xml:space="default">1.714</w:t>
+            </w:r>
+          </w:p>
+        </w:tc>
+        <w:tc>
+          <w:tcPr>
+            <w:tcBorders>
+              <w:top w:val="single" w:space="0" w:color="D3D3D3"/>
+              <w:bottom w:val="single" w:space="0" w:color="D3D3D3"/>
+              <w:start w:val="single" w:space="0" w:color="D3D3D3"/>
+              <w:end w:val="single" w:space="0" w:color="D3D3D3"/>
+            </w:tcBorders>
+          </w:tcPr>
+          <w:p>
+            <w:pPr>
+              <w:spacing w:before="0" w:after="60"/>
+              <w:keepNext/>
+              <w:jc w:val="end"/>
+            </w:pPr>
+            <w:r>
+              <w:rPr>
+                <w:rFonts w:ascii="Calibri" w:hAnsi="Calibri"/>
+                <w:sz w:val="20"/>
+              </w:rPr>
+              <w:t xml:space="default">0.065</w:t>
+            </w:r>
+          </w:p>
+        </w:tc>
+        <w:tc>
+          <w:tcPr>
+            <w:tcBorders>
+              <w:top w:val="single" w:space="0" w:color="D3D3D3"/>
+              <w:bottom w:val="single" w:space="0" w:color="D3D3D3"/>
+              <w:start w:val="single" w:space="0" w:color="D3D3D3"/>
+              <w:end w:val="single" w:space="0" w:color="D3D3D3"/>
+            </w:tcBorders>
+          </w:tcPr>
+          <w:p>
+            <w:pPr>
+              <w:spacing w:before="0" w:after="60"/>
+              <w:keepNext/>
+              <w:jc w:val="end"/>
+            </w:pPr>
+            <w:r>
+              <w:rPr>
+                <w:rFonts w:ascii="Calibri" w:hAnsi="Calibri"/>
+                <w:sz w:val="20"/>
+              </w:rPr>
+              <w:t xml:space="default">5.460</w:t>
+            </w:r>
+          </w:p>
+        </w:tc>
+        <w:tc>
+          <w:tcPr>
+            <w:tcBorders>
+              <w:top w:val="single" w:space="0" w:color="D3D3D3"/>
+              <w:bottom w:val="single" w:space="0" w:color="D3D3D3"/>
+              <w:start w:val="single" w:space="0" w:color="D3D3D3"/>
+              <w:end w:val="single" w:space="0" w:color="D3D3D3"/>
+            </w:tcBorders>
+          </w:tcPr>
+          <w:p>
+            <w:pPr>
+              <w:spacing w:before="0" w:after="60"/>
+              <w:keepNext/>
+              <w:jc w:val="end"/>
+            </w:pPr>
+            <w:r>
+              <w:rPr>
+                <w:rFonts w:ascii="Calibri" w:hAnsi="Calibri"/>
+                <w:sz w:val="20"/>
+              </w:rPr>
+              <w:t xml:space="default">0.100</w:t>
+            </w:r>
+          </w:p>
+        </w:tc>
+        <w:tc>
+          <w:tcPr>
+            <w:tcBorders>
+              <w:top w:val="single" w:space="0" w:color="D3D3D3"/>
+              <w:bottom w:val="single" w:space="0" w:color="D3D3D3"/>
+              <w:start w:val="single" w:space="0" w:color="D3D3D3"/>
+              <w:end w:val="single" w:space="0" w:color="D3D3D3"/>
+            </w:tcBorders>
+          </w:tcPr>
+          <w:p>
+            <w:pPr>
+              <w:spacing w:before="0" w:after="60"/>
+              <w:keepNext/>
+              <w:jc w:val="end"/>
+            </w:pPr>
+            <w:r>
+              <w:rPr>
+                <w:rFonts w:ascii="Calibri" w:hAnsi="Calibri"/>
+                <w:sz w:val="20"/>
+              </w:rPr>
+              <w:t xml:space="default">5.500</w:t>
             </w:r>
           </w:p>
         </w:tc>
@@ -966,7 +872,7 @@
             <w:pPr>
               <w:spacing w:before="0" w:after="60"/>
               <w:keepNext/>
-              <w:jc w:val="center"/>
+              <w:jc w:val="start"/>
             </w:pPr>
             <w:r>
               <w:rPr>
@@ -997,175 +903,151 @@
                 <w:rFonts w:ascii="Calibri" w:hAnsi="Calibri"/>
                 <w:sz w:val="20"/>
               </w:rPr>
-              <w:t xml:space="default">0.153</w:t>
-            </w:r>
-          </w:p>
-        </w:tc>
-        <w:tc>
-          <w:tcPr>
-            <w:tcBorders>
-              <w:top w:val="single" w:space="0" w:color="D3D3D3"/>
-              <w:bottom w:val="single" w:space="0" w:color="D3D3D3"/>
-              <w:start w:val="single" w:space="0" w:color="D3D3D3"/>
-              <w:end w:val="single" w:space="0" w:color="D3D3D3"/>
-            </w:tcBorders>
-          </w:tcPr>
-          <w:p>
-            <w:pPr>
-              <w:spacing w:before="0" w:after="60"/>
-              <w:keepNext/>
-              <w:jc w:val="end"/>
-            </w:pPr>
-            <w:r>
-              <w:rPr>
-                <w:rFonts w:ascii="Calibri" w:hAnsi="Calibri"/>
-                <w:sz w:val="20"/>
-              </w:rPr>
-              <w:t xml:space="default">0.014</w:t>
-            </w:r>
-          </w:p>
-        </w:tc>
-        <w:tc>
-          <w:tcPr>
-            <w:tcBorders>
-              <w:top w:val="single" w:space="0" w:color="D3D3D3"/>
-              <w:bottom w:val="single" w:space="0" w:color="D3D3D3"/>
-              <w:start w:val="single" w:space="0" w:color="D3D3D3"/>
-              <w:end w:val="single" w:space="0" w:color="D3D3D3"/>
-            </w:tcBorders>
-          </w:tcPr>
-          <w:p>
-            <w:pPr>
-              <w:spacing w:before="0" w:after="60"/>
-              <w:keepNext/>
-              <w:jc w:val="end"/>
-            </w:pPr>
-            <w:r>
-              <w:rPr>
-                <w:rFonts w:ascii="Calibri" w:hAnsi="Calibri"/>
-                <w:sz w:val="20"/>
-              </w:rPr>
-              <w:t xml:space="default">0.005</w:t>
-            </w:r>
-          </w:p>
-        </w:tc>
-        <w:tc>
-          <w:tcPr>
-            <w:tcBorders>
-              <w:top w:val="single" w:space="0" w:color="D3D3D3"/>
-              <w:bottom w:val="single" w:space="0" w:color="D3D3D3"/>
-              <w:start w:val="single" w:space="0" w:color="D3D3D3"/>
-              <w:end w:val="single" w:space="0" w:color="D3D3D3"/>
-            </w:tcBorders>
-          </w:tcPr>
-          <w:p>
-            <w:pPr>
-              <w:spacing w:before="0" w:after="60"/>
-              <w:keepNext/>
-              <w:jc w:val="end"/>
-            </w:pPr>
-            <w:r>
-              <w:rPr>
-                <w:rFonts w:ascii="Calibri" w:hAnsi="Calibri"/>
-                <w:sz w:val="20"/>
-              </w:rPr>
-              <w:t xml:space="default">0.026</w:t>
-            </w:r>
-          </w:p>
-        </w:tc>
-        <w:tc>
-          <w:tcPr>
-            <w:tcBorders>
-              <w:top w:val="single" w:space="0" w:color="D3D3D3"/>
-              <w:bottom w:val="single" w:space="0" w:color="D3D3D3"/>
-              <w:start w:val="single" w:space="0" w:color="D3D3D3"/>
-              <w:end w:val="single" w:space="0" w:color="D3D3D3"/>
-            </w:tcBorders>
-          </w:tcPr>
-          <w:p>
-            <w:pPr>
-              <w:spacing w:before="0" w:after="60"/>
-              <w:keepNext/>
-              <w:jc w:val="end"/>
-            </w:pPr>
-            <w:r>
-              <w:rPr>
-                <w:rFonts w:ascii="Calibri" w:hAnsi="Calibri"/>
-                <w:sz w:val="20"/>
-              </w:rPr>
-              <w:t xml:space="default">0.650</w:t>
-            </w:r>
-          </w:p>
-        </w:tc>
-        <w:tc>
-          <w:tcPr>
-            <w:tcBorders>
-              <w:top w:val="single" w:space="0" w:color="D3D3D3"/>
-              <w:bottom w:val="single" w:space="0" w:color="D3D3D3"/>
-              <w:start w:val="single" w:space="0" w:color="D3D3D3"/>
-              <w:end w:val="single" w:space="0" w:color="D3D3D3"/>
-            </w:tcBorders>
-          </w:tcPr>
-          <w:p>
-            <w:pPr>
-              <w:spacing w:before="0" w:after="60"/>
-              <w:keepNext/>
-              <w:jc w:val="end"/>
-            </w:pPr>
-            <w:r>
-              <w:rPr>
-                <w:rFonts w:ascii="Calibri" w:hAnsi="Calibri"/>
-                <w:sz w:val="20"/>
-              </w:rPr>
-              <w:t xml:space="default">0.395</w:t>
-            </w:r>
-          </w:p>
-        </w:tc>
-        <w:tc>
-          <w:tcPr>
-            <w:tcBorders>
-              <w:top w:val="single" w:space="0" w:color="D3D3D3"/>
-              <w:bottom w:val="single" w:space="0" w:color="D3D3D3"/>
-              <w:start w:val="single" w:space="0" w:color="D3D3D3"/>
-              <w:end w:val="single" w:space="0" w:color="D3D3D3"/>
-            </w:tcBorders>
-          </w:tcPr>
-          <w:p>
-            <w:pPr>
-              <w:spacing w:before="0" w:after="60"/>
-              <w:keepNext/>
-              <w:jc w:val="end"/>
-            </w:pPr>
-            <w:r>
-              <w:rPr>
-                <w:rFonts w:ascii="Calibri" w:hAnsi="Calibri"/>
-                <w:sz w:val="20"/>
-              </w:rPr>
-              <w:t xml:space="default">4.250</w:t>
-            </w:r>
-          </w:p>
-        </w:tc>
-        <w:tc>
-          <w:tcPr>
-            <w:tcBorders>
-              <w:top w:val="single" w:space="0" w:color="D3D3D3"/>
-              <w:bottom w:val="single" w:space="0" w:color="D3D3D3"/>
-              <w:start w:val="single" w:space="0" w:color="D3D3D3"/>
-              <w:end w:val="single" w:space="0" w:color="D3D3D3"/>
-            </w:tcBorders>
-          </w:tcPr>
-          <w:p>
-            <w:pPr>
-              <w:spacing w:before="0" w:after="60"/>
-              <w:keepNext/>
-              <w:jc w:val="end"/>
-            </w:pPr>
-            <w:r>
-              <w:rPr>
-                <w:rFonts w:ascii="Calibri" w:hAnsi="Calibri"/>
-                <w:sz w:val="20"/>
-              </w:rPr>
-              <w:t xml:space="default">60</w:t>
+              <w:t xml:space="default">257</w:t>
+            </w:r>
+          </w:p>
+        </w:tc>
+        <w:tc>
+          <w:tcPr>
+            <w:tcBorders>
+              <w:top w:val="single" w:space="0" w:color="D3D3D3"/>
+              <w:bottom w:val="single" w:space="0" w:color="D3D3D3"/>
+              <w:start w:val="single" w:space="0" w:color="D3D3D3"/>
+              <w:end w:val="single" w:space="0" w:color="D3D3D3"/>
+            </w:tcBorders>
+          </w:tcPr>
+          <w:p>
+            <w:pPr>
+              <w:spacing w:before="0" w:after="60"/>
+              <w:keepNext/>
+              <w:jc w:val="end"/>
+            </w:pPr>
+            <w:r>
+              <w:rPr>
+                <w:rFonts w:ascii="Calibri" w:hAnsi="Calibri"/>
+                <w:sz w:val="20"/>
+              </w:rPr>
+              <w:t xml:space="default">3.084</w:t>
+            </w:r>
+          </w:p>
+        </w:tc>
+        <w:tc>
+          <w:tcPr>
+            <w:tcBorders>
+              <w:top w:val="single" w:space="0" w:color="D3D3D3"/>
+              <w:bottom w:val="single" w:space="0" w:color="D3D3D3"/>
+              <w:start w:val="single" w:space="0" w:color="D3D3D3"/>
+              <w:end w:val="single" w:space="0" w:color="D3D3D3"/>
+            </w:tcBorders>
+          </w:tcPr>
+          <w:p>
+            <w:pPr>
+              <w:spacing w:before="0" w:after="60"/>
+              <w:keepNext/>
+              <w:jc w:val="end"/>
+            </w:pPr>
+            <w:r>
+              <w:rPr>
+                <w:rFonts w:ascii="Calibri" w:hAnsi="Calibri"/>
+                <w:sz w:val="20"/>
+              </w:rPr>
+              <w:t xml:space="default">1.768</w:t>
+            </w:r>
+          </w:p>
+        </w:tc>
+        <w:tc>
+          <w:tcPr>
+            <w:tcBorders>
+              <w:top w:val="single" w:space="0" w:color="D3D3D3"/>
+              <w:bottom w:val="single" w:space="0" w:color="D3D3D3"/>
+              <w:start w:val="single" w:space="0" w:color="D3D3D3"/>
+              <w:end w:val="single" w:space="0" w:color="D3D3D3"/>
+            </w:tcBorders>
+          </w:tcPr>
+          <w:p>
+            <w:pPr>
+              <w:spacing w:before="0" w:after="60"/>
+              <w:keepNext/>
+              <w:jc w:val="end"/>
+            </w:pPr>
+            <w:r>
+              <w:rPr>
+                <w:rFonts w:ascii="Calibri" w:hAnsi="Calibri"/>
+                <w:sz w:val="20"/>
+              </w:rPr>
+              <w:t xml:space="default">0.000</w:t>
+            </w:r>
+          </w:p>
+        </w:tc>
+        <w:tc>
+          <w:tcPr>
+            <w:tcBorders>
+              <w:top w:val="single" w:space="0" w:color="D3D3D3"/>
+              <w:bottom w:val="single" w:space="0" w:color="D3D3D3"/>
+              <w:start w:val="single" w:space="0" w:color="D3D3D3"/>
+              <w:end w:val="single" w:space="0" w:color="D3D3D3"/>
+            </w:tcBorders>
+          </w:tcPr>
+          <w:p>
+            <w:pPr>
+              <w:spacing w:before="0" w:after="60"/>
+              <w:keepNext/>
+              <w:jc w:val="end"/>
+            </w:pPr>
+            <w:r>
+              <w:rPr>
+                <w:rFonts w:ascii="Calibri" w:hAnsi="Calibri"/>
+                <w:sz w:val="20"/>
+              </w:rPr>
+              <w:t xml:space="default">6.000</w:t>
+            </w:r>
+          </w:p>
+        </w:tc>
+        <w:tc>
+          <w:tcPr>
+            <w:tcBorders>
+              <w:top w:val="single" w:space="0" w:color="D3D3D3"/>
+              <w:bottom w:val="single" w:space="0" w:color="D3D3D3"/>
+              <w:start w:val="single" w:space="0" w:color="D3D3D3"/>
+              <w:end w:val="single" w:space="0" w:color="D3D3D3"/>
+            </w:tcBorders>
+          </w:tcPr>
+          <w:p>
+            <w:pPr>
+              <w:spacing w:before="0" w:after="60"/>
+              <w:keepNext/>
+              <w:jc w:val="end"/>
+            </w:pPr>
+            <w:r>
+              <w:rPr>
+                <w:rFonts w:ascii="Calibri" w:hAnsi="Calibri"/>
+                <w:sz w:val="20"/>
+              </w:rPr>
+              <w:t xml:space="default">0.100</w:t>
+            </w:r>
+          </w:p>
+        </w:tc>
+        <w:tc>
+          <w:tcPr>
+            <w:tcBorders>
+              <w:top w:val="single" w:space="0" w:color="D3D3D3"/>
+              <w:bottom w:val="single" w:space="0" w:color="D3D3D3"/>
+              <w:start w:val="single" w:space="0" w:color="D3D3D3"/>
+              <w:end w:val="single" w:space="0" w:color="D3D3D3"/>
+            </w:tcBorders>
+          </w:tcPr>
+          <w:p>
+            <w:pPr>
+              <w:spacing w:before="0" w:after="60"/>
+              <w:keepNext/>
+              <w:jc w:val="end"/>
+            </w:pPr>
+            <w:r>
+              <w:rPr>
+                <w:rFonts w:ascii="Calibri" w:hAnsi="Calibri"/>
+                <w:sz w:val="20"/>
+              </w:rPr>
+              <w:t xml:space="default">6.000</w:t>
             </w:r>
           </w:p>
         </w:tc>
@@ -1187,7 +1069,7 @@
             <w:pPr>
               <w:spacing w:before="0" w:after="60"/>
               <w:keepNext/>
-              <w:jc w:val="center"/>
+              <w:jc w:val="start"/>
             </w:pPr>
             <w:r>
               <w:rPr>
@@ -1218,175 +1100,151 @@
                 <w:rFonts w:ascii="Calibri" w:hAnsi="Calibri"/>
                 <w:sz w:val="20"/>
               </w:rPr>
-              <w:t xml:space="default">0.165</w:t>
-            </w:r>
-          </w:p>
-        </w:tc>
-        <w:tc>
-          <w:tcPr>
-            <w:tcBorders>
-              <w:top w:val="single" w:space="0" w:color="D3D3D3"/>
-              <w:bottom w:val="single" w:space="0" w:color="D3D3D3"/>
-              <w:start w:val="single" w:space="0" w:color="D3D3D3"/>
-              <w:end w:val="single" w:space="0" w:color="D3D3D3"/>
-            </w:tcBorders>
-          </w:tcPr>
-          <w:p>
-            <w:pPr>
-              <w:spacing w:before="0" w:after="60"/>
-              <w:keepNext/>
-              <w:jc w:val="end"/>
-            </w:pPr>
-            <w:r>
-              <w:rPr>
-                <w:rFonts w:ascii="Calibri" w:hAnsi="Calibri"/>
-                <w:sz w:val="20"/>
-              </w:rPr>
-              <w:t xml:space="default">0.027</w:t>
-            </w:r>
-          </w:p>
-        </w:tc>
-        <w:tc>
-          <w:tcPr>
-            <w:tcBorders>
-              <w:top w:val="single" w:space="0" w:color="D3D3D3"/>
-              <w:bottom w:val="single" w:space="0" w:color="D3D3D3"/>
-              <w:start w:val="single" w:space="0" w:color="D3D3D3"/>
-              <w:end w:val="single" w:space="0" w:color="D3D3D3"/>
-            </w:tcBorders>
-          </w:tcPr>
-          <w:p>
-            <w:pPr>
-              <w:spacing w:before="0" w:after="60"/>
-              <w:keepNext/>
-              <w:jc w:val="end"/>
-            </w:pPr>
-            <w:r>
-              <w:rPr>
-                <w:rFonts w:ascii="Calibri" w:hAnsi="Calibri"/>
-                <w:sz w:val="20"/>
-              </w:rPr>
-              <w:t xml:space="default">0.009</w:t>
-            </w:r>
-          </w:p>
-        </w:tc>
-        <w:tc>
-          <w:tcPr>
-            <w:tcBorders>
-              <w:top w:val="single" w:space="0" w:color="D3D3D3"/>
-              <w:bottom w:val="single" w:space="0" w:color="D3D3D3"/>
-              <w:start w:val="single" w:space="0" w:color="D3D3D3"/>
-              <w:end w:val="single" w:space="0" w:color="D3D3D3"/>
-            </w:tcBorders>
-          </w:tcPr>
-          <w:p>
-            <w:pPr>
-              <w:spacing w:before="0" w:after="60"/>
-              <w:keepNext/>
-              <w:jc w:val="end"/>
-            </w:pPr>
-            <w:r>
-              <w:rPr>
-                <w:rFonts w:ascii="Calibri" w:hAnsi="Calibri"/>
-                <w:sz w:val="20"/>
-              </w:rPr>
-              <w:t xml:space="default">0.000</w:t>
-            </w:r>
-          </w:p>
-        </w:tc>
-        <w:tc>
-          <w:tcPr>
-            <w:tcBorders>
-              <w:top w:val="single" w:space="0" w:color="D3D3D3"/>
-              <w:bottom w:val="single" w:space="0" w:color="D3D3D3"/>
-              <w:start w:val="single" w:space="0" w:color="D3D3D3"/>
-              <w:end w:val="single" w:space="0" w:color="D3D3D3"/>
-            </w:tcBorders>
-          </w:tcPr>
-          <w:p>
-            <w:pPr>
-              <w:spacing w:before="0" w:after="60"/>
-              <w:keepNext/>
-              <w:jc w:val="end"/>
-            </w:pPr>
-            <w:r>
-              <w:rPr>
-                <w:rFonts w:ascii="Calibri" w:hAnsi="Calibri"/>
-                <w:sz w:val="20"/>
-              </w:rPr>
-              <w:t xml:space="default">2.650</w:t>
-            </w:r>
-          </w:p>
-        </w:tc>
-        <w:tc>
-          <w:tcPr>
-            <w:tcBorders>
-              <w:top w:val="single" w:space="0" w:color="D3D3D3"/>
-              <w:bottom w:val="single" w:space="0" w:color="D3D3D3"/>
-              <w:start w:val="single" w:space="0" w:color="D3D3D3"/>
-              <w:end w:val="single" w:space="0" w:color="D3D3D3"/>
-            </w:tcBorders>
-          </w:tcPr>
-          <w:p>
-            <w:pPr>
-              <w:spacing w:before="0" w:after="60"/>
-              <w:keepNext/>
-              <w:jc w:val="end"/>
-            </w:pPr>
-            <w:r>
-              <w:rPr>
-                <w:rFonts w:ascii="Calibri" w:hAnsi="Calibri"/>
-                <w:sz w:val="20"/>
-              </w:rPr>
-              <w:t xml:space="default">0.633</w:t>
-            </w:r>
-          </w:p>
-        </w:tc>
-        <w:tc>
-          <w:tcPr>
-            <w:tcBorders>
-              <w:top w:val="single" w:space="0" w:color="D3D3D3"/>
-              <w:bottom w:val="single" w:space="0" w:color="D3D3D3"/>
-              <w:start w:val="single" w:space="0" w:color="D3D3D3"/>
-              <w:end w:val="single" w:space="0" w:color="D3D3D3"/>
-            </w:tcBorders>
-          </w:tcPr>
-          <w:p>
-            <w:pPr>
-              <w:spacing w:before="0" w:after="60"/>
-              <w:keepNext/>
-              <w:jc w:val="end"/>
-            </w:pPr>
-            <w:r>
-              <w:rPr>
-                <w:rFonts w:ascii="Calibri" w:hAnsi="Calibri"/>
-                <w:sz w:val="20"/>
-              </w:rPr>
-              <w:t xml:space="default">1.050</w:t>
-            </w:r>
-          </w:p>
-        </w:tc>
-        <w:tc>
-          <w:tcPr>
-            <w:tcBorders>
-              <w:top w:val="single" w:space="0" w:color="D3D3D3"/>
-              <w:bottom w:val="single" w:space="0" w:color="D3D3D3"/>
-              <w:start w:val="single" w:space="0" w:color="D3D3D3"/>
-              <w:end w:val="single" w:space="0" w:color="D3D3D3"/>
-            </w:tcBorders>
-          </w:tcPr>
-          <w:p>
-            <w:pPr>
-              <w:spacing w:before="0" w:after="60"/>
-              <w:keepNext/>
-              <w:jc w:val="end"/>
-            </w:pPr>
-            <w:r>
-              <w:rPr>
-                <w:rFonts w:ascii="Calibri" w:hAnsi="Calibri"/>
-                <w:sz w:val="20"/>
-              </w:rPr>
-              <w:t xml:space="default">60</w:t>
+              <w:t xml:space="default">24</w:t>
+            </w:r>
+          </w:p>
+        </w:tc>
+        <w:tc>
+          <w:tcPr>
+            <w:tcBorders>
+              <w:top w:val="single" w:space="0" w:color="D3D3D3"/>
+              <w:bottom w:val="single" w:space="0" w:color="D3D3D3"/>
+              <w:start w:val="single" w:space="0" w:color="D3D3D3"/>
+              <w:end w:val="single" w:space="0" w:color="D3D3D3"/>
+            </w:tcBorders>
+          </w:tcPr>
+          <w:p>
+            <w:pPr>
+              <w:spacing w:before="0" w:after="60"/>
+              <w:keepNext/>
+              <w:jc w:val="end"/>
+            </w:pPr>
+            <w:r>
+              <w:rPr>
+                <w:rFonts w:ascii="Calibri" w:hAnsi="Calibri"/>
+                <w:sz w:val="20"/>
+              </w:rPr>
+              <w:t xml:space="default">2.610</w:t>
+            </w:r>
+          </w:p>
+        </w:tc>
+        <w:tc>
+          <w:tcPr>
+            <w:tcBorders>
+              <w:top w:val="single" w:space="0" w:color="D3D3D3"/>
+              <w:bottom w:val="single" w:space="0" w:color="D3D3D3"/>
+              <w:start w:val="single" w:space="0" w:color="D3D3D3"/>
+              <w:end w:val="single" w:space="0" w:color="D3D3D3"/>
+            </w:tcBorders>
+          </w:tcPr>
+          <w:p>
+            <w:pPr>
+              <w:spacing w:before="0" w:after="60"/>
+              <w:keepNext/>
+              <w:jc w:val="end"/>
+            </w:pPr>
+            <w:r>
+              <w:rPr>
+                <w:rFonts w:ascii="Calibri" w:hAnsi="Calibri"/>
+                <w:sz w:val="20"/>
+              </w:rPr>
+              <w:t xml:space="default">1.887</w:t>
+            </w:r>
+          </w:p>
+        </w:tc>
+        <w:tc>
+          <w:tcPr>
+            <w:tcBorders>
+              <w:top w:val="single" w:space="0" w:color="D3D3D3"/>
+              <w:bottom w:val="single" w:space="0" w:color="D3D3D3"/>
+              <w:start w:val="single" w:space="0" w:color="D3D3D3"/>
+              <w:end w:val="single" w:space="0" w:color="D3D3D3"/>
+            </w:tcBorders>
+          </w:tcPr>
+          <w:p>
+            <w:pPr>
+              <w:spacing w:before="0" w:after="60"/>
+              <w:keepNext/>
+              <w:jc w:val="end"/>
+            </w:pPr>
+            <w:r>
+              <w:rPr>
+                <w:rFonts w:ascii="Calibri" w:hAnsi="Calibri"/>
+                <w:sz w:val="20"/>
+              </w:rPr>
+              <w:t xml:space="default">0.265</w:t>
+            </w:r>
+          </w:p>
+        </w:tc>
+        <w:tc>
+          <w:tcPr>
+            <w:tcBorders>
+              <w:top w:val="single" w:space="0" w:color="D3D3D3"/>
+              <w:bottom w:val="single" w:space="0" w:color="D3D3D3"/>
+              <w:start w:val="single" w:space="0" w:color="D3D3D3"/>
+              <w:end w:val="single" w:space="0" w:color="D3D3D3"/>
+            </w:tcBorders>
+          </w:tcPr>
+          <w:p>
+            <w:pPr>
+              <w:spacing w:before="0" w:after="60"/>
+              <w:keepNext/>
+              <w:jc w:val="end"/>
+            </w:pPr>
+            <w:r>
+              <w:rPr>
+                <w:rFonts w:ascii="Calibri" w:hAnsi="Calibri"/>
+                <w:sz w:val="20"/>
+              </w:rPr>
+              <w:t xml:space="default">5.930</w:t>
+            </w:r>
+          </w:p>
+        </w:tc>
+        <w:tc>
+          <w:tcPr>
+            <w:tcBorders>
+              <w:top w:val="single" w:space="0" w:color="D3D3D3"/>
+              <w:bottom w:val="single" w:space="0" w:color="D3D3D3"/>
+              <w:start w:val="single" w:space="0" w:color="D3D3D3"/>
+              <w:end w:val="single" w:space="0" w:color="D3D3D3"/>
+            </w:tcBorders>
+          </w:tcPr>
+          <w:p>
+            <w:pPr>
+              <w:spacing w:before="0" w:after="60"/>
+              <w:keepNext/>
+              <w:jc w:val="end"/>
+            </w:pPr>
+            <w:r>
+              <w:rPr>
+                <w:rFonts w:ascii="Calibri" w:hAnsi="Calibri"/>
+                <w:sz w:val="20"/>
+              </w:rPr>
+              <w:t xml:space="default">0.300</w:t>
+            </w:r>
+          </w:p>
+        </w:tc>
+        <w:tc>
+          <w:tcPr>
+            <w:tcBorders>
+              <w:top w:val="single" w:space="0" w:color="D3D3D3"/>
+              <w:bottom w:val="single" w:space="0" w:color="D3D3D3"/>
+              <w:start w:val="single" w:space="0" w:color="D3D3D3"/>
+              <w:end w:val="single" w:space="0" w:color="D3D3D3"/>
+            </w:tcBorders>
+          </w:tcPr>
+          <w:p>
+            <w:pPr>
+              <w:spacing w:before="0" w:after="60"/>
+              <w:keepNext/>
+              <w:jc w:val="end"/>
+            </w:pPr>
+            <w:r>
+              <w:rPr>
+                <w:rFonts w:ascii="Calibri" w:hAnsi="Calibri"/>
+                <w:sz w:val="20"/>
+              </w:rPr>
+              <w:t xml:space="default">6.000</w:t>
             </w:r>
           </w:p>
         </w:tc>

</xml_diff>